<commit_message>
added to lliterature review, started on chapter 3
</commit_message>
<xml_diff>
--- a/LaTeX/Thesis/chapters/GenAI_Code of conduct_AJ 2526_EN.docx
+++ b/LaTeX/Thesis/chapters/GenAI_Code of conduct_AJ 2526_EN.docx
@@ -1165,6 +1165,7 @@
         <w:rPr>
           <w:rFonts w:ascii="Calibri" w:hAnsi="Calibri" w:cs="Calibri"/>
           <w:bCs/>
+          <w:lang w:val="en-GB"/>
         </w:rPr>
         <w:t> </w:t>
       </w:r>
@@ -1198,6 +1199,7 @@
         <w:rPr>
           <w:rFonts w:ascii="Calibri" w:hAnsi="Calibri" w:cs="Calibri"/>
           <w:bCs/>
+          <w:lang w:val="en-GB"/>
         </w:rPr>
         <w:t xml:space="preserve">If your master’s thesis is under </w:t>
       </w:r>
@@ -1216,6 +1218,7 @@
         <w:rPr>
           <w:rFonts w:ascii="Calibri" w:hAnsi="Calibri" w:cs="Calibri"/>
           <w:bCs/>
+          <w:lang w:val="en-GB"/>
         </w:rPr>
         <w:t>,</w:t>
       </w:r>
@@ -1309,30 +1312,35 @@
       <w:r>
         <w:rPr>
           <w:rFonts w:ascii="Calibri" w:hAnsi="Calibri" w:cs="Calibri"/>
+          <w:lang w:val="en-GB"/>
         </w:rPr>
         <w:t>Before using a GenAI tool, always consider whether it</w:t>
       </w:r>
       <w:r>
         <w:rPr>
           <w:rFonts w:ascii="Calibri" w:hAnsi="Calibri" w:cs="Calibri"/>
+          <w:lang w:val="en-GB"/>
         </w:rPr>
         <w:t>s use is</w:t>
       </w:r>
       <w:r>
         <w:rPr>
           <w:rFonts w:ascii="Calibri" w:hAnsi="Calibri" w:cs="Calibri"/>
+          <w:lang w:val="en-GB"/>
         </w:rPr>
         <w:t xml:space="preserve"> </w:t>
       </w:r>
       <w:r>
         <w:rPr>
           <w:rFonts w:ascii="Calibri" w:hAnsi="Calibri" w:cs="Calibri"/>
+          <w:lang w:val="en-GB"/>
         </w:rPr>
         <w:t>responsible</w:t>
       </w:r>
       <w:r>
         <w:rPr>
           <w:rFonts w:ascii="Calibri" w:hAnsi="Calibri" w:cs="Calibri"/>
+          <w:lang w:val="en-GB"/>
         </w:rPr>
         <w:t xml:space="preserve">, including from a </w:t>
       </w:r>
@@ -1343,6 +1351,7 @@
             <w:rFonts w:ascii="Calibri" w:hAnsi="Calibri" w:cs="Calibri"/>
             <w:b/>
             <w:bCs/>
+            <w:lang w:val="en-GB"/>
           </w:rPr>
           <w:t>sustainability perspective</w:t>
         </w:r>
@@ -1352,12 +1361,14 @@
           <w:rFonts w:ascii="Calibri" w:hAnsi="Calibri" w:cs="Calibri"/>
           <w:b/>
           <w:bCs/>
+          <w:lang w:val="en-GB"/>
         </w:rPr>
         <w:t xml:space="preserve"> </w:t>
       </w:r>
       <w:r>
         <w:rPr>
           <w:rFonts w:ascii="Calibri" w:hAnsi="Calibri" w:cs="Calibri"/>
+          <w:lang w:val="en-GB"/>
         </w:rPr>
         <w:t>(e.g. when using GenAI as a search engine, language assistant,…).</w:t>
       </w:r>
@@ -1945,7 +1956,7 @@
         <w:rPr>
           <w:rFonts w:eastAsia="Times New Roman" w:cstheme="minorHAnsi"/>
           <w:color w:val="505050"/>
-          <w:lang w:eastAsia="sv-SE"/>
+          <w:lang w:val="en-GB" w:eastAsia="sv-SE"/>
         </w:rPr>
         <w:t> </w:t>
       </w:r>
@@ -2058,6 +2069,12 @@
         <w:rPr>
           <w:lang w:val="en-US"/>
         </w:rPr>
+        <w:t>Lars Deprez</w:t>
+      </w:r>
+      <w:r>
+        <w:rPr>
+          <w:lang w:val="en-US"/>
+        </w:rPr>
         <w:tab/>
       </w:r>
       <w:r>
@@ -2076,7 +2093,25 @@
           <w:bCs/>
           <w:lang w:val="en-US"/>
         </w:rPr>
-        <w:t xml:space="preserve"> ………………………………………………..</w:t>
+        <w:t xml:space="preserve"> </w:t>
+      </w:r>
+      <w:r>
+        <w:rPr>
+          <w:rFonts w:ascii="Calibri" w:hAnsi="Calibri" w:cs="Calibri"/>
+          <w:b/>
+          <w:bCs/>
+          <w:lang w:val="en-US"/>
+        </w:rPr>
+        <w:t>r0880586</w:t>
+      </w:r>
+      <w:r>
+        <w:rPr>
+          <w:rFonts w:ascii="Calibri" w:hAnsi="Calibri" w:cs="Calibri"/>
+          <w:b/>
+          <w:bCs/>
+          <w:lang w:val="en-US"/>
+        </w:rPr>
+        <w:tab/>
       </w:r>
       <w:r>
         <w:rPr>
@@ -2420,7 +2455,7 @@
           <w:rFonts w:ascii="Calibri" w:eastAsia="Times New Roman" w:hAnsi="Calibri" w:cs="Calibri"/>
           <w:lang w:val="en-GB" w:eastAsia="nl-BE"/>
         </w:rPr>
-        <w:t>O</w:t>
+        <w:t>x</w:t>
       </w:r>
       <w:r>
         <w:rPr>
@@ -2554,6 +2589,13 @@
       </w:r>
       <w:r>
         <w:rPr>
+          <w:rFonts w:ascii="Calibri" w:eastAsia="Times New Roman" w:hAnsi="Calibri" w:cs="Calibri"/>
+          <w:lang w:val="en-US" w:eastAsia="nl-BE"/>
+        </w:rPr>
+        <w:t>Miniature and customer friendly solution for tracking and locating insects</w:t>
+      </w:r>
+      <w:r>
+        <w:rPr>
           <w:lang w:val="en-US"/>
         </w:rPr>
         <w:tab/>
@@ -2596,28 +2638,14 @@
           <w:rFonts w:ascii="Calibri" w:eastAsia="Times New Roman" w:hAnsi="Calibri" w:cs="Calibri"/>
           <w:lang w:val="en-US" w:eastAsia="nl-BE"/>
         </w:rPr>
-        <w:t xml:space="preserve">  </w:t>
+        <w:t xml:space="preserve"> Gilles</w:t>
       </w:r>
       <w:r>
         <w:rPr>
           <w:rFonts w:ascii="Calibri" w:eastAsia="Times New Roman" w:hAnsi="Calibri" w:cs="Calibri"/>
           <w:lang w:val="en-US" w:eastAsia="nl-BE"/>
         </w:rPr>
-        <w:t>…………</w:t>
-      </w:r>
-      <w:r>
-        <w:rPr>
-          <w:rFonts w:ascii="Calibri" w:eastAsia="Times New Roman" w:hAnsi="Calibri" w:cs="Calibri"/>
-          <w:lang w:val="en-US" w:eastAsia="nl-BE"/>
-        </w:rPr>
-        <w:t>…………..</w:t>
-      </w:r>
-      <w:r>
-        <w:rPr>
-          <w:rFonts w:ascii="Calibri" w:eastAsia="Times New Roman" w:hAnsi="Calibri" w:cs="Calibri"/>
-          <w:lang w:val="en-US" w:eastAsia="nl-BE"/>
-        </w:rPr>
-        <w:t>…</w:t>
+        <w:t xml:space="preserve"> Callebaut</w:t>
       </w:r>
       <w:r>
         <w:rPr>
@@ -2674,6 +2702,20 @@
       <w:r>
         <w:rPr>
           <w:rFonts w:ascii="Calibri" w:eastAsia="Times New Roman" w:hAnsi="Calibri" w:cs="Calibri"/>
+          <w:lang w:val="en-US" w:eastAsia="nl-BE"/>
+        </w:rPr>
+        <w:t>Gilles</w:t>
+      </w:r>
+      <w:r>
+        <w:rPr>
+          <w:rFonts w:ascii="Calibri" w:eastAsia="Times New Roman" w:hAnsi="Calibri" w:cs="Calibri"/>
+          <w:lang w:val="en-US" w:eastAsia="nl-BE"/>
+        </w:rPr>
+        <w:t xml:space="preserve"> Callebaut</w:t>
+      </w:r>
+      <w:r>
+        <w:rPr>
+          <w:rFonts w:ascii="Calibri" w:eastAsia="Times New Roman" w:hAnsi="Calibri" w:cs="Calibri"/>
           <w:lang w:val="en-GB" w:eastAsia="nl-BE"/>
         </w:rPr>
         <w:tab/>
@@ -2824,7 +2866,14 @@
           <w:rFonts w:ascii="Calibri" w:eastAsia="Times New Roman" w:hAnsi="Calibri" w:cs="Calibri"/>
           <w:lang w:val="en-GB" w:eastAsia="nl-BE"/>
         </w:rPr>
-        <w:t xml:space="preserve">O </w:t>
+        <w:t>x</w:t>
+      </w:r>
+      <w:r>
+        <w:rPr>
+          <w:rFonts w:ascii="Calibri" w:eastAsia="Times New Roman" w:hAnsi="Calibri" w:cs="Calibri"/>
+          <w:lang w:val="en-GB" w:eastAsia="nl-BE"/>
+        </w:rPr>
+        <w:t xml:space="preserve"> </w:t>
       </w:r>
       <w:r>
         <w:rPr>
@@ -2936,7 +2985,7 @@
     </w:p>
     <w:tbl>
       <w:tblPr>
-        <w:tblStyle w:val="Tabelraster"/>
+        <w:tblStyle w:val="TableGrid"/>
         <w:tblW w:w="15304" w:type="dxa"/>
         <w:tblLook w:val="04A0" w:firstRow="1" w:lastRow="0" w:firstColumn="1" w:lastColumn="0" w:noHBand="0" w:noVBand="1"/>
       </w:tblPr>
@@ -3228,6 +3277,13 @@
                 <w:lang w:val="en-GB" w:eastAsia="nl-BE"/>
               </w:rPr>
             </w:pPr>
+            <w:r>
+              <w:rPr>
+                <w:rFonts w:ascii="Calibri" w:eastAsia="Times New Roman" w:hAnsi="Calibri" w:cs="Calibri"/>
+                <w:lang w:val="en-GB" w:eastAsia="nl-BE"/>
+              </w:rPr>
+              <w:t>Fixing spelling mistakes and making texts easier to read.</w:t>
+            </w:r>
           </w:p>
         </w:tc>
         <w:tc>
@@ -3339,7 +3395,7 @@
           </w:p>
           <w:p>
             <w:pPr>
-              <w:pStyle w:val="Lijstalinea"/>
+              <w:pStyle w:val="ListParagraph"/>
               <w:numPr>
                 <w:ilvl w:val="0"/>
                 <w:numId w:val="10"/>
@@ -3528,7 +3584,7 @@
           </w:p>
           <w:p>
             <w:pPr>
-              <w:pStyle w:val="Lijstalinea"/>
+              <w:pStyle w:val="ListParagraph"/>
               <w:numPr>
                 <w:ilvl w:val="0"/>
                 <w:numId w:val="10"/>
@@ -3761,6 +3817,7 @@
                 <w:bCs/>
                 <w:lang w:val="en-US" w:eastAsia="nl-BE"/>
               </w:rPr>
+              <w:lastRenderedPageBreak/>
               <w:t>However, b</w:t>
             </w:r>
             <w:r>
@@ -3775,7 +3832,7 @@
           </w:p>
           <w:p>
             <w:pPr>
-              <w:pStyle w:val="Lijstalinea"/>
+              <w:pStyle w:val="ListParagraph"/>
               <w:numPr>
                 <w:ilvl w:val="0"/>
                 <w:numId w:val="10"/>
@@ -3868,7 +3925,7 @@
           </w:p>
           <w:p>
             <w:pPr>
-              <w:pStyle w:val="Lijstalinea"/>
+              <w:pStyle w:val="ListParagraph"/>
               <w:numPr>
                 <w:ilvl w:val="0"/>
                 <w:numId w:val="10"/>
@@ -3946,6 +4003,7 @@
                 <w:b/>
                 <w:lang w:val="en-GB" w:eastAsia="nl-BE"/>
               </w:rPr>
+              <w:lastRenderedPageBreak/>
               <w:t>As a search engine to get information on a topic or to search for existing research on the topic</w:t>
             </w:r>
           </w:p>
@@ -3964,6 +4022,13 @@
                 <w:lang w:val="en-GB" w:eastAsia="nl-BE"/>
               </w:rPr>
             </w:pPr>
+            <w:r>
+              <w:rPr>
+                <w:rFonts w:ascii="Calibri" w:eastAsia="Times New Roman" w:hAnsi="Calibri" w:cs="Calibri"/>
+                <w:lang w:val="en-GB" w:eastAsia="nl-BE"/>
+              </w:rPr>
+              <w:t xml:space="preserve">For finding the right components. </w:t>
+            </w:r>
           </w:p>
         </w:tc>
         <w:tc>
@@ -4106,7 +4171,7 @@
           </w:p>
           <w:p>
             <w:pPr>
-              <w:pStyle w:val="Lijstalinea"/>
+              <w:pStyle w:val="ListParagraph"/>
               <w:numPr>
                 <w:ilvl w:val="0"/>
                 <w:numId w:val="10"/>
@@ -4287,6 +4352,20 @@
                 <w:lang w:val="en-GB" w:eastAsia="nl-BE"/>
               </w:rPr>
             </w:pPr>
+            <w:r>
+              <w:rPr>
+                <w:rFonts w:ascii="Calibri" w:eastAsia="Times New Roman" w:hAnsi="Calibri" w:cs="Calibri"/>
+                <w:lang w:val="en-GB" w:eastAsia="nl-BE"/>
+              </w:rPr>
+              <w:t xml:space="preserve">To find good papers, </w:t>
+            </w:r>
+            <w:r>
+              <w:rPr>
+                <w:rFonts w:ascii="Calibri" w:eastAsia="Times New Roman" w:hAnsi="Calibri" w:cs="Calibri"/>
+                <w:lang w:val="en-GB" w:eastAsia="nl-BE"/>
+              </w:rPr>
+              <w:t>actual lookup and reading was one on google scholar, lime, etc</w:t>
+            </w:r>
           </w:p>
         </w:tc>
         <w:tc>
@@ -4455,7 +4534,7 @@
           </w:p>
           <w:p>
             <w:pPr>
-              <w:pStyle w:val="Lijstalinea"/>
+              <w:pStyle w:val="ListParagraph"/>
               <w:numPr>
                 <w:ilvl w:val="0"/>
                 <w:numId w:val="10"/>
@@ -4511,7 +4590,17 @@
                 <w:bCs/>
                 <w:lang w:val="en-GB" w:eastAsia="nl-BE"/>
               </w:rPr>
-              <w:t>Interpret, analyse and process the information you obtained; verify it and do</w:t>
+              <w:t xml:space="preserve">Interpret, analyse and process </w:t>
+            </w:r>
+            <w:r>
+              <w:rPr>
+                <w:rFonts w:ascii="Calibri" w:eastAsia="Times New Roman" w:hAnsi="Calibri" w:cs="Calibri"/>
+                <w:b/>
+                <w:bCs/>
+                <w:lang w:val="en-GB" w:eastAsia="nl-BE"/>
+              </w:rPr>
+              <w:lastRenderedPageBreak/>
+              <w:t>the information you obtained; verify it and do</w:t>
             </w:r>
             <w:r>
               <w:rPr>
@@ -4566,7 +4655,7 @@
           </w:p>
           <w:p>
             <w:pPr>
-              <w:pStyle w:val="Lijstalinea"/>
+              <w:pStyle w:val="ListParagraph"/>
               <w:numPr>
                 <w:ilvl w:val="0"/>
                 <w:numId w:val="10"/>
@@ -4669,6 +4758,7 @@
                 <w:bCs/>
                 <w:lang w:val="en-GB" w:eastAsia="nl-BE"/>
               </w:rPr>
+              <w:lastRenderedPageBreak/>
               <w:t>For g</w:t>
             </w:r>
             <w:r>
@@ -4705,6 +4795,13 @@
                 <w:lang w:val="en-GB" w:eastAsia="nl-BE"/>
               </w:rPr>
             </w:pPr>
+            <w:r>
+              <w:rPr>
+                <w:rFonts w:ascii="Calibri" w:eastAsia="Times New Roman" w:hAnsi="Calibri" w:cs="Calibri"/>
+                <w:lang w:val="en-GB" w:eastAsia="nl-BE"/>
+              </w:rPr>
+              <w:t>/</w:t>
+            </w:r>
           </w:p>
         </w:tc>
         <w:tc>
@@ -4872,6 +4969,13 @@
                 <w:lang w:val="en-GB" w:eastAsia="nl-BE"/>
               </w:rPr>
             </w:pPr>
+            <w:r>
+              <w:rPr>
+                <w:rFonts w:ascii="Calibri" w:eastAsia="Times New Roman" w:hAnsi="Calibri" w:cs="Calibri"/>
+                <w:lang w:val="en-GB" w:eastAsia="nl-BE"/>
+              </w:rPr>
+              <w:t>/</w:t>
+            </w:r>
           </w:p>
         </w:tc>
         <w:tc>
@@ -4955,7 +5059,7 @@
           </w:p>
           <w:p>
             <w:pPr>
-              <w:pStyle w:val="Lijstalinea"/>
+              <w:pStyle w:val="ListParagraph"/>
               <w:numPr>
                 <w:ilvl w:val="0"/>
                 <w:numId w:val="10"/>
@@ -5052,7 +5156,7 @@
           </w:p>
           <w:p>
             <w:pPr>
-              <w:pStyle w:val="Lijstalinea"/>
+              <w:pStyle w:val="ListParagraph"/>
               <w:numPr>
                 <w:ilvl w:val="0"/>
                 <w:numId w:val="10"/>
@@ -5108,6 +5212,13 @@
                 <w:lang w:val="en-GB" w:eastAsia="nl-BE"/>
               </w:rPr>
             </w:pPr>
+            <w:r>
+              <w:rPr>
+                <w:rFonts w:ascii="Calibri" w:eastAsia="Times New Roman" w:hAnsi="Calibri" w:cs="Calibri"/>
+                <w:lang w:val="en-GB" w:eastAsia="nl-BE"/>
+              </w:rPr>
+              <w:t>/</w:t>
+            </w:r>
           </w:p>
         </w:tc>
         <w:tc>
@@ -5251,7 +5362,7 @@
           </w:p>
           <w:p>
             <w:pPr>
-              <w:pStyle w:val="Lijstalinea"/>
+              <w:pStyle w:val="ListParagraph"/>
               <w:numPr>
                 <w:ilvl w:val="0"/>
                 <w:numId w:val="10"/>
@@ -5314,6 +5425,7 @@
                 <w:bCs/>
                 <w:lang w:val="en-GB" w:eastAsia="nl-BE"/>
               </w:rPr>
+              <w:lastRenderedPageBreak/>
               <w:t>For g</w:t>
             </w:r>
             <w:r>
@@ -5380,6 +5492,13 @@
                 <w:lang w:val="en-GB" w:eastAsia="nl-BE"/>
               </w:rPr>
             </w:pPr>
+            <w:r>
+              <w:rPr>
+                <w:rFonts w:ascii="Calibri" w:eastAsia="Times New Roman" w:hAnsi="Calibri" w:cs="Calibri"/>
+                <w:lang w:val="en-GB" w:eastAsia="nl-BE"/>
+              </w:rPr>
+              <w:t>/</w:t>
+            </w:r>
           </w:p>
         </w:tc>
         <w:tc>
@@ -5511,7 +5630,7 @@
           </w:p>
           <w:p>
             <w:pPr>
-              <w:pStyle w:val="Lijstalinea"/>
+              <w:pStyle w:val="ListParagraph"/>
               <w:numPr>
                 <w:ilvl w:val="0"/>
                 <w:numId w:val="10"/>
@@ -5619,7 +5738,7 @@
           </w:p>
           <w:p>
             <w:pPr>
-              <w:pStyle w:val="Lijstalinea"/>
+              <w:pStyle w:val="ListParagraph"/>
               <w:numPr>
                 <w:ilvl w:val="0"/>
                 <w:numId w:val="10"/>
@@ -5744,6 +5863,13 @@
                 <w:lang w:val="en-GB" w:eastAsia="nl-BE"/>
               </w:rPr>
             </w:pPr>
+            <w:r>
+              <w:rPr>
+                <w:rFonts w:ascii="Calibri" w:eastAsia="Times New Roman" w:hAnsi="Calibri" w:cs="Calibri"/>
+                <w:lang w:val="en-GB" w:eastAsia="nl-BE"/>
+              </w:rPr>
+              <w:t>/</w:t>
+            </w:r>
           </w:p>
         </w:tc>
         <w:tc>
@@ -5776,6 +5902,7 @@
             <w:r>
               <w:rPr>
                 <w:rStyle w:val="ui-provider"/>
+                <w:lang w:val="en-GB"/>
               </w:rPr>
               <w:t xml:space="preserve"> audio or video</w:t>
             </w:r>
@@ -5824,7 +5951,7 @@
           </w:p>
           <w:p>
             <w:pPr>
-              <w:pStyle w:val="Lijstalinea"/>
+              <w:pStyle w:val="ListParagraph"/>
               <w:numPr>
                 <w:ilvl w:val="0"/>
                 <w:numId w:val="10"/>
@@ -5869,7 +5996,7 @@
           </w:p>
           <w:p>
             <w:pPr>
-              <w:pStyle w:val="Lijstalinea"/>
+              <w:pStyle w:val="ListParagraph"/>
               <w:numPr>
                 <w:ilvl w:val="0"/>
                 <w:numId w:val="10"/>
@@ -5966,7 +6093,7 @@
           </w:p>
           <w:p>
             <w:pPr>
-              <w:pStyle w:val="Lijstalinea"/>
+              <w:pStyle w:val="ListParagraph"/>
               <w:numPr>
                 <w:ilvl w:val="0"/>
                 <w:numId w:val="10"/>
@@ -6083,6 +6210,34 @@
                 <w:lang w:val="en-GB" w:eastAsia="nl-BE"/>
               </w:rPr>
             </w:pPr>
+            <w:r>
+              <w:rPr>
+                <w:rFonts w:ascii="Calibri" w:eastAsia="Times New Roman" w:hAnsi="Calibri" w:cs="Calibri"/>
+                <w:lang w:val="en-GB" w:eastAsia="nl-BE"/>
+              </w:rPr>
+              <w:t>Debugging simulations</w:t>
+            </w:r>
+            <w:r>
+              <w:rPr>
+                <w:rFonts w:ascii="Calibri" w:eastAsia="Times New Roman" w:hAnsi="Calibri" w:cs="Calibri"/>
+                <w:lang w:val="en-GB" w:eastAsia="nl-BE"/>
+              </w:rPr>
+              <w:t xml:space="preserve"> and</w:t>
+            </w:r>
+            <w:r>
+              <w:rPr>
+                <w:rFonts w:ascii="Calibri" w:eastAsia="Times New Roman" w:hAnsi="Calibri" w:cs="Calibri"/>
+                <w:lang w:val="en-GB" w:eastAsia="nl-BE"/>
+              </w:rPr>
+              <w:t xml:space="preserve"> helping understanding circuit</w:t>
+            </w:r>
+            <w:r>
+              <w:rPr>
+                <w:rFonts w:ascii="Calibri" w:eastAsia="Times New Roman" w:hAnsi="Calibri" w:cs="Calibri"/>
+                <w:lang w:val="en-GB" w:eastAsia="nl-BE"/>
+              </w:rPr>
+              <w:t>.</w:t>
+            </w:r>
           </w:p>
         </w:tc>
         <w:tc>
@@ -6241,6 +6396,7 @@
                 <w:rFonts w:ascii="Calibri" w:eastAsia="Times New Roman" w:hAnsi="Calibri" w:cs="Calibri"/>
                 <w:lang w:val="en-GB" w:eastAsia="nl-BE"/>
               </w:rPr>
+              <w:lastRenderedPageBreak/>
               <w:t>Motivate how you</w:t>
             </w:r>
             <w:r>
@@ -6458,7 +6614,7 @@
     <w:sdtContent>
       <w:p>
         <w:pPr>
-          <w:pStyle w:val="Voettekst"/>
+          <w:pStyle w:val="Footer"/>
           <w:jc w:val="right"/>
           <w:rPr>
             <w:lang w:val="en-US"/>
@@ -6494,7 +6650,7 @@
   </w:sdt>
   <w:p>
     <w:pPr>
-      <w:pStyle w:val="Voettekst"/>
+      <w:pStyle w:val="Footer"/>
       <w:rPr>
         <w:i/>
         <w:iCs/>
@@ -8235,18 +8391,18 @@
     <w:lsdException w:name="Unresolved Mention" w:semiHidden="1" w:unhideWhenUsed="1"/>
     <w:lsdException w:name="Smart Link" w:semiHidden="1" w:unhideWhenUsed="1"/>
   </w:latentStyles>
-  <w:style w:type="paragraph" w:default="1" w:styleId="Standaard">
+  <w:style w:type="paragraph" w:default="1" w:styleId="Normal">
     <w:name w:val="Normal"/>
     <w:qFormat/>
     <w:rsid w:val="000C5295"/>
   </w:style>
-  <w:style w:type="character" w:default="1" w:styleId="Standaardalinea-lettertype">
+  <w:style w:type="character" w:default="1" w:styleId="DefaultParagraphFont">
     <w:name w:val="Default Paragraph Font"/>
     <w:uiPriority w:val="1"/>
     <w:semiHidden/>
     <w:unhideWhenUsed/>
   </w:style>
-  <w:style w:type="table" w:default="1" w:styleId="Standaardtabel">
+  <w:style w:type="table" w:default="1" w:styleId="TableNormal">
     <w:name w:val="Normal Table"/>
     <w:uiPriority w:val="99"/>
     <w:semiHidden/>
@@ -8261,16 +8417,16 @@
       </w:tblCellMar>
     </w:tblPr>
   </w:style>
-  <w:style w:type="numbering" w:default="1" w:styleId="Geenlijst">
+  <w:style w:type="numbering" w:default="1" w:styleId="NoList">
     <w:name w:val="No List"/>
     <w:uiPriority w:val="99"/>
     <w:semiHidden/>
     <w:unhideWhenUsed/>
   </w:style>
-  <w:style w:type="paragraph" w:styleId="Koptekst">
+  <w:style w:type="paragraph" w:styleId="Header">
     <w:name w:val="header"/>
-    <w:basedOn w:val="Standaard"/>
-    <w:link w:val="KoptekstChar"/>
+    <w:basedOn w:val="Normal"/>
+    <w:link w:val="HeaderChar"/>
     <w:uiPriority w:val="99"/>
     <w:unhideWhenUsed/>
     <w:rsid w:val="000C5295"/>
@@ -8282,17 +8438,17 @@
       <w:spacing w:after="0" w:line="240" w:lineRule="auto"/>
     </w:pPr>
   </w:style>
-  <w:style w:type="character" w:customStyle="1" w:styleId="KoptekstChar">
-    <w:name w:val="Koptekst Char"/>
-    <w:basedOn w:val="Standaardalinea-lettertype"/>
-    <w:link w:val="Koptekst"/>
+  <w:style w:type="character" w:customStyle="1" w:styleId="HeaderChar">
+    <w:name w:val="Header Char"/>
+    <w:basedOn w:val="DefaultParagraphFont"/>
+    <w:link w:val="Header"/>
     <w:uiPriority w:val="99"/>
     <w:rsid w:val="000C5295"/>
   </w:style>
-  <w:style w:type="paragraph" w:styleId="Voettekst">
+  <w:style w:type="paragraph" w:styleId="Footer">
     <w:name w:val="footer"/>
-    <w:basedOn w:val="Standaard"/>
-    <w:link w:val="VoettekstChar"/>
+    <w:basedOn w:val="Normal"/>
+    <w:link w:val="FooterChar"/>
     <w:uiPriority w:val="99"/>
     <w:unhideWhenUsed/>
     <w:rsid w:val="000C5295"/>
@@ -8304,16 +8460,16 @@
       <w:spacing w:after="0" w:line="240" w:lineRule="auto"/>
     </w:pPr>
   </w:style>
-  <w:style w:type="character" w:customStyle="1" w:styleId="VoettekstChar">
-    <w:name w:val="Voettekst Char"/>
-    <w:basedOn w:val="Standaardalinea-lettertype"/>
-    <w:link w:val="Voettekst"/>
+  <w:style w:type="character" w:customStyle="1" w:styleId="FooterChar">
+    <w:name w:val="Footer Char"/>
+    <w:basedOn w:val="DefaultParagraphFont"/>
+    <w:link w:val="Footer"/>
     <w:uiPriority w:val="99"/>
     <w:rsid w:val="000C5295"/>
   </w:style>
-  <w:style w:type="paragraph" w:styleId="Lijstalinea">
+  <w:style w:type="paragraph" w:styleId="ListParagraph">
     <w:name w:val="List Paragraph"/>
-    <w:basedOn w:val="Standaard"/>
+    <w:basedOn w:val="Normal"/>
     <w:uiPriority w:val="34"/>
     <w:qFormat/>
     <w:rsid w:val="005B3750"/>
@@ -8324,7 +8480,7 @@
   </w:style>
   <w:style w:type="character" w:styleId="Hyperlink">
     <w:name w:val="Hyperlink"/>
-    <w:basedOn w:val="Standaardalinea-lettertype"/>
+    <w:basedOn w:val="DefaultParagraphFont"/>
     <w:uiPriority w:val="99"/>
     <w:unhideWhenUsed/>
     <w:rsid w:val="0024270B"/>
@@ -8333,9 +8489,9 @@
       <w:u w:val="single"/>
     </w:rPr>
   </w:style>
-  <w:style w:type="character" w:styleId="Onopgelostemelding">
+  <w:style w:type="character" w:styleId="UnresolvedMention">
     <w:name w:val="Unresolved Mention"/>
-    <w:basedOn w:val="Standaardalinea-lettertype"/>
+    <w:basedOn w:val="DefaultParagraphFont"/>
     <w:uiPriority w:val="99"/>
     <w:semiHidden/>
     <w:unhideWhenUsed/>
@@ -8345,7 +8501,7 @@
       <w:shd w:val="clear" w:color="auto" w:fill="E1DFDD"/>
     </w:rPr>
   </w:style>
-  <w:style w:type="paragraph" w:styleId="Revisie">
+  <w:style w:type="paragraph" w:styleId="Revision">
     <w:name w:val="Revision"/>
     <w:hidden/>
     <w:uiPriority w:val="99"/>
@@ -8355,9 +8511,9 @@
       <w:spacing w:after="0" w:line="240" w:lineRule="auto"/>
     </w:pPr>
   </w:style>
-  <w:style w:type="table" w:styleId="Tabelraster">
+  <w:style w:type="table" w:styleId="TableGrid">
     <w:name w:val="Table Grid"/>
-    <w:basedOn w:val="Standaardtabel"/>
+    <w:basedOn w:val="TableNormal"/>
     <w:uiPriority w:val="39"/>
     <w:rsid w:val="00CB2593"/>
     <w:pPr>
@@ -8374,9 +8530,9 @@
       </w:tblBorders>
     </w:tblPr>
   </w:style>
-  <w:style w:type="character" w:styleId="GevolgdeHyperlink">
+  <w:style w:type="character" w:styleId="FollowedHyperlink">
     <w:name w:val="FollowedHyperlink"/>
-    <w:basedOn w:val="Standaardalinea-lettertype"/>
+    <w:basedOn w:val="DefaultParagraphFont"/>
     <w:uiPriority w:val="99"/>
     <w:semiHidden/>
     <w:unhideWhenUsed/>
@@ -8388,12 +8544,12 @@
   </w:style>
   <w:style w:type="character" w:customStyle="1" w:styleId="ui-provider">
     <w:name w:val="ui-provider"/>
-    <w:basedOn w:val="Standaardalinea-lettertype"/>
+    <w:basedOn w:val="DefaultParagraphFont"/>
     <w:rsid w:val="00D41EF5"/>
   </w:style>
-  <w:style w:type="character" w:styleId="Verwijzingopmerking">
+  <w:style w:type="character" w:styleId="CommentReference">
     <w:name w:val="annotation reference"/>
-    <w:basedOn w:val="Standaardalinea-lettertype"/>
+    <w:basedOn w:val="DefaultParagraphFont"/>
     <w:uiPriority w:val="99"/>
     <w:semiHidden/>
     <w:unhideWhenUsed/>
@@ -8403,10 +8559,10 @@
       <w:szCs w:val="16"/>
     </w:rPr>
   </w:style>
-  <w:style w:type="paragraph" w:styleId="Tekstopmerking">
+  <w:style w:type="paragraph" w:styleId="CommentText">
     <w:name w:val="annotation text"/>
-    <w:basedOn w:val="Standaard"/>
-    <w:link w:val="TekstopmerkingChar"/>
+    <w:basedOn w:val="Normal"/>
+    <w:link w:val="CommentTextChar"/>
     <w:uiPriority w:val="99"/>
     <w:unhideWhenUsed/>
     <w:rsid w:val="00C13916"/>
@@ -8418,10 +8574,10 @@
       <w:szCs w:val="20"/>
     </w:rPr>
   </w:style>
-  <w:style w:type="character" w:customStyle="1" w:styleId="TekstopmerkingChar">
-    <w:name w:val="Tekst opmerking Char"/>
-    <w:basedOn w:val="Standaardalinea-lettertype"/>
-    <w:link w:val="Tekstopmerking"/>
+  <w:style w:type="character" w:customStyle="1" w:styleId="CommentTextChar">
+    <w:name w:val="Comment Text Char"/>
+    <w:basedOn w:val="DefaultParagraphFont"/>
+    <w:link w:val="CommentText"/>
     <w:uiPriority w:val="99"/>
     <w:rsid w:val="00C13916"/>
     <w:rPr>
@@ -8429,11 +8585,11 @@
       <w:szCs w:val="20"/>
     </w:rPr>
   </w:style>
-  <w:style w:type="paragraph" w:styleId="Onderwerpvanopmerking">
+  <w:style w:type="paragraph" w:styleId="CommentSubject">
     <w:name w:val="annotation subject"/>
-    <w:basedOn w:val="Tekstopmerking"/>
-    <w:next w:val="Tekstopmerking"/>
-    <w:link w:val="OnderwerpvanopmerkingChar"/>
+    <w:basedOn w:val="CommentText"/>
+    <w:next w:val="CommentText"/>
+    <w:link w:val="CommentSubjectChar"/>
     <w:uiPriority w:val="99"/>
     <w:semiHidden/>
     <w:unhideWhenUsed/>
@@ -8443,10 +8599,10 @@
       <w:bCs/>
     </w:rPr>
   </w:style>
-  <w:style w:type="character" w:customStyle="1" w:styleId="OnderwerpvanopmerkingChar">
-    <w:name w:val="Onderwerp van opmerking Char"/>
-    <w:basedOn w:val="TekstopmerkingChar"/>
-    <w:link w:val="Onderwerpvanopmerking"/>
+  <w:style w:type="character" w:customStyle="1" w:styleId="CommentSubjectChar">
+    <w:name w:val="Comment Subject Char"/>
+    <w:basedOn w:val="CommentTextChar"/>
+    <w:link w:val="CommentSubject"/>
     <w:uiPriority w:val="99"/>
     <w:semiHidden/>
     <w:rsid w:val="00C13916"/>
@@ -8459,7 +8615,7 @@
   </w:style>
   <w:style w:type="paragraph" w:customStyle="1" w:styleId="pf0">
     <w:name w:val="pf0"/>
-    <w:basedOn w:val="Standaard"/>
+    <w:basedOn w:val="Normal"/>
     <w:rsid w:val="00E70582"/>
     <w:pPr>
       <w:spacing w:before="100" w:beforeAutospacing="1" w:after="100" w:afterAutospacing="1" w:line="240" w:lineRule="auto"/>
@@ -8473,7 +8629,7 @@
   </w:style>
   <w:style w:type="character" w:customStyle="1" w:styleId="cf01">
     <w:name w:val="cf01"/>
-    <w:basedOn w:val="Standaardalinea-lettertype"/>
+    <w:basedOn w:val="DefaultParagraphFont"/>
     <w:rsid w:val="00E70582"/>
     <w:rPr>
       <w:rFonts w:ascii="Segoe UI" w:hAnsi="Segoe UI" w:cs="Segoe UI" w:hint="default"/>
@@ -8780,6 +8936,10 @@
 </file>
 
 <file path=customXml/item1.xml><?xml version="1.0" encoding="utf-8"?>
+<b:Sources xmlns:b="http://schemas.openxmlformats.org/officeDocument/2006/bibliography" xmlns="http://schemas.openxmlformats.org/officeDocument/2006/bibliography" SelectedStyle="\APASixthEditionOfficeOnline.xsl" StyleName="APA" Version="6"/>
+</file>
+
+<file path=customXml/item2.xml><?xml version="1.0" encoding="utf-8"?>
 <?mso-contentType ?>
 <FormTemplates xmlns="http://schemas.microsoft.com/sharepoint/v3/contenttype/forms">
   <Display>DocumentLibraryForm</Display>
@@ -8788,21 +8948,7 @@
 </FormTemplates>
 </file>
 
-<file path=customXml/item2.xml><?xml version="1.0" encoding="utf-8"?>
-<b:Sources xmlns:b="http://schemas.openxmlformats.org/officeDocument/2006/bibliography" xmlns="http://schemas.openxmlformats.org/officeDocument/2006/bibliography" SelectedStyle="\APASixthEditionOfficeOnline.xsl" StyleName="APA" Version="6"/>
-</file>
-
 <file path=customXml/item3.xml><?xml version="1.0" encoding="utf-8"?>
-<p:properties xmlns:p="http://schemas.microsoft.com/office/2006/metadata/properties" xmlns:xsi="http://www.w3.org/2001/XMLSchema-instance" xmlns:pc="http://schemas.microsoft.com/office/infopath/2007/PartnerControls">
-  <documentManagement>
-    <lcf76f155ced4ddcb4097134ff3c332f xmlns="09a95e20-259e-43b2-8648-99ec21a3a5ce">
-      <Terms xmlns="http://schemas.microsoft.com/office/infopath/2007/PartnerControls"/>
-    </lcf76f155ced4ddcb4097134ff3c332f>
-  </documentManagement>
-</p:properties>
-</file>
-
-<file path=customXml/item4.xml><?xml version="1.0" encoding="utf-8"?>
 <ct:contentTypeSchema xmlns:ct="http://schemas.microsoft.com/office/2006/metadata/contentType" xmlns:ma="http://schemas.microsoft.com/office/2006/metadata/properties/metaAttributes" ct:_="" ma:_="" ma:contentTypeName="Document" ma:contentTypeID="0x010100C716486488F8A3489750D63DDC4FAC04" ma:contentTypeVersion="10" ma:contentTypeDescription="Een nieuw document maken." ma:contentTypeScope="" ma:versionID="f750bf31995c20f45ee86359f8380f30">
   <xsd:schema xmlns:xsd="http://www.w3.org/2001/XMLSchema" xmlns:xs="http://www.w3.org/2001/XMLSchema" xmlns:p="http://schemas.microsoft.com/office/2006/metadata/properties" xmlns:ns2="09a95e20-259e-43b2-8648-99ec21a3a5ce" targetNamespace="http://schemas.microsoft.com/office/2006/metadata/properties" ma:root="true" ma:fieldsID="9b7df407231c270903648bf95ac226c3" ns2:_="">
     <xsd:import namespace="09a95e20-259e-43b2-8648-99ec21a3a5ce"/>
@@ -8980,7 +9126,25 @@
 </ct:contentTypeSchema>
 </file>
 
+<file path=customXml/item4.xml><?xml version="1.0" encoding="utf-8"?>
+<p:properties xmlns:p="http://schemas.microsoft.com/office/2006/metadata/properties" xmlns:xsi="http://www.w3.org/2001/XMLSchema-instance" xmlns:pc="http://schemas.microsoft.com/office/infopath/2007/PartnerControls">
+  <documentManagement>
+    <lcf76f155ced4ddcb4097134ff3c332f xmlns="09a95e20-259e-43b2-8648-99ec21a3a5ce">
+      <Terms xmlns="http://schemas.microsoft.com/office/infopath/2007/PartnerControls"/>
+    </lcf76f155ced4ddcb4097134ff3c332f>
+  </documentManagement>
+</p:properties>
+</file>
+
 <file path=customXml/itemProps1.xml><?xml version="1.0" encoding="utf-8"?>
+<ds:datastoreItem xmlns:ds="http://schemas.openxmlformats.org/officeDocument/2006/customXml" ds:itemID="{C1A24BE5-68FC-4F1E-9BA0-44D4761E22DE}">
+  <ds:schemaRefs>
+    <ds:schemaRef ds:uri="http://schemas.openxmlformats.org/officeDocument/2006/bibliography"/>
+  </ds:schemaRefs>
+</ds:datastoreItem>
+</file>
+
+<file path=customXml/itemProps2.xml><?xml version="1.0" encoding="utf-8"?>
 <ds:datastoreItem xmlns:ds="http://schemas.openxmlformats.org/officeDocument/2006/customXml" ds:itemID="{1D0323DB-097F-4B51-A834-8E447F214FD4}">
   <ds:schemaRefs>
     <ds:schemaRef ds:uri="http://schemas.microsoft.com/sharepoint/v3/contenttype/forms"/>
@@ -8988,25 +9152,7 @@
 </ds:datastoreItem>
 </file>
 
-<file path=customXml/itemProps2.xml><?xml version="1.0" encoding="utf-8"?>
-<ds:datastoreItem xmlns:ds="http://schemas.openxmlformats.org/officeDocument/2006/customXml" ds:itemID="{C1A24BE5-68FC-4F1E-9BA0-44D4761E22DE}">
-  <ds:schemaRefs>
-    <ds:schemaRef ds:uri="http://schemas.openxmlformats.org/officeDocument/2006/bibliography"/>
-  </ds:schemaRefs>
-</ds:datastoreItem>
-</file>
-
 <file path=customXml/itemProps3.xml><?xml version="1.0" encoding="utf-8"?>
-<ds:datastoreItem xmlns:ds="http://schemas.openxmlformats.org/officeDocument/2006/customXml" ds:itemID="{1EB2F818-F0B1-4FD5-BEDD-A60EC2C5B691}">
-  <ds:schemaRefs>
-    <ds:schemaRef ds:uri="http://schemas.microsoft.com/office/2006/metadata/properties"/>
-    <ds:schemaRef ds:uri="http://schemas.microsoft.com/office/infopath/2007/PartnerControls"/>
-    <ds:schemaRef ds:uri="09a95e20-259e-43b2-8648-99ec21a3a5ce"/>
-  </ds:schemaRefs>
-</ds:datastoreItem>
-</file>
-
-<file path=customXml/itemProps4.xml><?xml version="1.0" encoding="utf-8"?>
 <ds:datastoreItem xmlns:ds="http://schemas.openxmlformats.org/officeDocument/2006/customXml" ds:itemID="{C90D5E29-0732-44BE-BE58-AAF3180B4899}">
   <ds:schemaRefs>
     <ds:schemaRef ds:uri="http://schemas.microsoft.com/office/2006/metadata/contentType"/>
@@ -9022,4 +9168,14 @@
     <ds:schemaRef ds:uri="http://schemas.microsoft.com/internal/obd"/>
   </ds:schemaRefs>
 </ds:datastoreItem>
+</file>
+
+<file path=customXml/itemProps4.xml><?xml version="1.0" encoding="utf-8"?>
+<ds:datastoreItem xmlns:ds="http://schemas.openxmlformats.org/officeDocument/2006/customXml" ds:itemID="{1EB2F818-F0B1-4FD5-BEDD-A60EC2C5B691}">
+  <ds:schemaRefs>
+    <ds:schemaRef ds:uri="http://schemas.microsoft.com/office/2006/metadata/properties"/>
+    <ds:schemaRef ds:uri="http://schemas.microsoft.com/office/infopath/2007/PartnerControls"/>
+    <ds:schemaRef ds:uri="09a95e20-259e-43b2-8648-99ec21a3a5ce"/>
+  </ds:schemaRefs>
+</ds:datastoreItem>
 </file>
</xml_diff>